<commit_message>
Updated project management doc
</commit_message>
<xml_diff>
--- a/manuscript/revision/HGT paper_to follow up for PNAS revision.docx
+++ b/manuscript/revision/HGT paper_to follow up for PNAS revision.docx
@@ -1023,25 +1023,7 @@
         <w:rPr>
           <w:highlight w:val="cyan"/>
         </w:rPr>
-        <w:t>During manual BLAST inspections</w:t>
-      </w:r>
-      <w:r>
-        <w:rPr>
-          <w:highlight w:val="cyan"/>
-        </w:rPr>
-        <w:t xml:space="preserve"> of the longest inserts</w:t>
-      </w:r>
-      <w:r>
-        <w:rPr>
-          <w:highlight w:val="cyan"/>
-        </w:rPr>
-        <w:t xml:space="preserve">, </w:t>
-      </w:r>
-      <w:r>
-        <w:rPr>
-          <w:highlight w:val="cyan"/>
-        </w:rPr>
-        <w:t>w</w:t>
+        <w:t>During manual BLAST inspections of the longest inserts, w</w:t>
       </w:r>
       <w:r>
         <w:rPr>
@@ -1065,13 +1047,7 @@
         <w:rPr>
           <w:highlight w:val="cyan"/>
         </w:rPr>
-        <w:t xml:space="preserve">, </w:t>
-      </w:r>
-      <w:r>
-        <w:rPr>
-          <w:highlight w:val="cyan"/>
-        </w:rPr>
-        <w:t xml:space="preserve">comprising </w:t>
+        <w:t xml:space="preserve">, comprising </w:t>
       </w:r>
       <w:proofErr w:type="spellStart"/>
       <w:r>
@@ -1397,8 +1373,6 @@
         </w:rPr>
         <w:t>To do’s</w:t>
       </w:r>
-      <w:bookmarkStart w:id="0" w:name="_GoBack"/>
-      <w:bookmarkEnd w:id="0"/>
     </w:p>
     <w:p>
       <w:pPr>
@@ -1491,6 +1465,7 @@
           <w:rFonts w:ascii="Calibri" w:eastAsia="Times New Roman" w:hAnsi="Calibri" w:cs="Calibri"/>
           <w:color w:val="000000"/>
           <w:kern w:val="0"/>
+          <w:highlight w:val="green"/>
           <w:lang w:val="en-AU" w:eastAsia="zh-CN"/>
           <w14:ligatures w14:val="none"/>
         </w:rPr>
@@ -1504,6 +1479,7 @@
           <w:iCs/>
           <w:color w:val="000000"/>
           <w:kern w:val="0"/>
+          <w:highlight w:val="green"/>
           <w:lang w:val="en-AU" w:eastAsia="zh-CN"/>
           <w14:ligatures w14:val="none"/>
         </w:rPr>
@@ -1514,6 +1490,7 @@
           <w:rFonts w:ascii="Calibri" w:eastAsia="Times New Roman" w:hAnsi="Calibri" w:cs="Calibri"/>
           <w:color w:val="000000"/>
           <w:kern w:val="0"/>
+          <w:highlight w:val="green"/>
           <w:lang w:val="en-AU" w:eastAsia="zh-CN"/>
           <w14:ligatures w14:val="none"/>
         </w:rPr>
@@ -1525,6 +1502,7 @@
           <w:rFonts w:ascii="Calibri" w:eastAsia="Times New Roman" w:hAnsi="Calibri" w:cs="Calibri"/>
           <w:color w:val="000000"/>
           <w:kern w:val="0"/>
+          <w:highlight w:val="green"/>
           <w:lang w:val="en-AU" w:eastAsia="zh-CN"/>
           <w14:ligatures w14:val="none"/>
         </w:rPr>
@@ -1536,10 +1514,33 @@
           <w:rFonts w:ascii="Calibri" w:eastAsia="Times New Roman" w:hAnsi="Calibri" w:cs="Calibri"/>
           <w:color w:val="000000"/>
           <w:kern w:val="0"/>
-          <w:lang w:val="en-AU" w:eastAsia="zh-CN"/>
-          <w14:ligatures w14:val="none"/>
-        </w:rPr>
-        <w:t>.</w:t>
+          <w:highlight w:val="green"/>
+          <w:lang w:val="en-AU" w:eastAsia="zh-CN"/>
+          <w14:ligatures w14:val="none"/>
+        </w:rPr>
+        <w:t xml:space="preserve"> </w:t>
+      </w:r>
+      <w:r>
+        <w:rPr>
+          <w:rFonts w:ascii="Calibri" w:eastAsia="Times New Roman" w:hAnsi="Calibri" w:cs="Calibri"/>
+          <w:color w:val="000000"/>
+          <w:kern w:val="0"/>
+          <w:highlight w:val="green"/>
+          <w:lang w:val="en-AU" w:eastAsia="zh-CN"/>
+          <w14:ligatures w14:val="none"/>
+        </w:rPr>
+        <w:sym w:font="Wingdings" w:char="F0E0"/>
+      </w:r>
+      <w:r>
+        <w:rPr>
+          <w:rFonts w:ascii="Calibri" w:eastAsia="Times New Roman" w:hAnsi="Calibri" w:cs="Calibri"/>
+          <w:color w:val="000000"/>
+          <w:kern w:val="0"/>
+          <w:highlight w:val="green"/>
+          <w:lang w:val="en-AU" w:eastAsia="zh-CN"/>
+          <w14:ligatures w14:val="none"/>
+        </w:rPr>
+        <w:t xml:space="preserve"> DONE</w:t>
       </w:r>
     </w:p>
     <w:p>
@@ -1984,6 +1985,7 @@
           <w:rFonts w:ascii="Calibri" w:eastAsia="Times New Roman" w:hAnsi="Calibri" w:cs="Calibri"/>
           <w:color w:val="000000"/>
           <w:kern w:val="0"/>
+          <w:highlight w:val="green"/>
           <w:lang w:val="en-AU" w:eastAsia="zh-CN"/>
           <w14:ligatures w14:val="none"/>
         </w:rPr>
@@ -1998,6 +2000,7 @@
           <w:iCs/>
           <w:color w:val="000000"/>
           <w:kern w:val="0"/>
+          <w:highlight w:val="green"/>
           <w:lang w:val="en-AU" w:eastAsia="zh-CN"/>
           <w14:ligatures w14:val="none"/>
         </w:rPr>
@@ -2013,6 +2016,7 @@
           <w:iCs/>
           <w:color w:val="000000"/>
           <w:kern w:val="0"/>
+          <w:highlight w:val="green"/>
           <w:lang w:val="en-AU" w:eastAsia="zh-CN"/>
           <w14:ligatures w14:val="none"/>
         </w:rPr>
@@ -2023,6 +2027,7 @@
           <w:rFonts w:ascii="Calibri" w:eastAsia="Times New Roman" w:hAnsi="Calibri" w:cs="Calibri"/>
           <w:color w:val="000000"/>
           <w:kern w:val="0"/>
+          <w:highlight w:val="green"/>
           <w:lang w:val="en-AU" w:eastAsia="zh-CN"/>
           <w14:ligatures w14:val="none"/>
         </w:rPr>
@@ -2034,6 +2039,7 @@
           <w:rFonts w:ascii="Calibri" w:eastAsia="Times New Roman" w:hAnsi="Calibri" w:cs="Calibri"/>
           <w:color w:val="000000"/>
           <w:kern w:val="0"/>
+          <w:highlight w:val="green"/>
           <w:lang w:val="en-AU" w:eastAsia="zh-CN"/>
           <w14:ligatures w14:val="none"/>
         </w:rPr>
@@ -2045,6 +2051,7 @@
           <w:rFonts w:ascii="Calibri" w:eastAsia="Times New Roman" w:hAnsi="Calibri" w:cs="Calibri"/>
           <w:color w:val="000000"/>
           <w:kern w:val="0"/>
+          <w:highlight w:val="green"/>
           <w:lang w:val="en-AU" w:eastAsia="zh-CN"/>
           <w14:ligatures w14:val="none"/>
         </w:rPr>
@@ -2056,6 +2063,7 @@
           <w:rFonts w:ascii="Calibri" w:eastAsia="Times New Roman" w:hAnsi="Calibri" w:cs="Calibri"/>
           <w:color w:val="000000"/>
           <w:kern w:val="0"/>
+          <w:highlight w:val="green"/>
           <w:lang w:val="en-AU" w:eastAsia="zh-CN"/>
           <w14:ligatures w14:val="none"/>
         </w:rPr>
@@ -2067,6 +2075,7 @@
           <w:rFonts w:ascii="Calibri" w:eastAsia="Times New Roman" w:hAnsi="Calibri" w:cs="Calibri"/>
           <w:color w:val="000000"/>
           <w:kern w:val="0"/>
+          <w:highlight w:val="green"/>
           <w:lang w:val="en-AU" w:eastAsia="zh-CN"/>
           <w14:ligatures w14:val="none"/>
         </w:rPr>
@@ -2078,6 +2087,7 @@
           <w:rFonts w:ascii="Calibri" w:eastAsia="Times New Roman" w:hAnsi="Calibri" w:cs="Calibri"/>
           <w:color w:val="000000"/>
           <w:kern w:val="0"/>
+          <w:highlight w:val="green"/>
           <w:lang w:val="en-AU" w:eastAsia="zh-CN"/>
           <w14:ligatures w14:val="none"/>
         </w:rPr>
@@ -2089,10 +2099,33 @@
           <w:rFonts w:ascii="Calibri" w:eastAsia="Times New Roman" w:hAnsi="Calibri" w:cs="Calibri"/>
           <w:color w:val="000000"/>
           <w:kern w:val="0"/>
-          <w:lang w:val="en-AU" w:eastAsia="zh-CN"/>
-          <w14:ligatures w14:val="none"/>
-        </w:rPr>
-        <w:t>. I believe all the others have already been added?</w:t>
+          <w:highlight w:val="green"/>
+          <w:lang w:val="en-AU" w:eastAsia="zh-CN"/>
+          <w14:ligatures w14:val="none"/>
+        </w:rPr>
+        <w:t xml:space="preserve"> </w:t>
+      </w:r>
+      <w:r>
+        <w:rPr>
+          <w:rFonts w:ascii="Calibri" w:eastAsia="Times New Roman" w:hAnsi="Calibri" w:cs="Calibri"/>
+          <w:color w:val="000000"/>
+          <w:kern w:val="0"/>
+          <w:highlight w:val="green"/>
+          <w:lang w:val="en-AU" w:eastAsia="zh-CN"/>
+          <w14:ligatures w14:val="none"/>
+        </w:rPr>
+        <w:sym w:font="Wingdings" w:char="F0E0"/>
+      </w:r>
+      <w:r>
+        <w:rPr>
+          <w:rFonts w:ascii="Calibri" w:eastAsia="Times New Roman" w:hAnsi="Calibri" w:cs="Calibri"/>
+          <w:color w:val="000000"/>
+          <w:kern w:val="0"/>
+          <w:highlight w:val="green"/>
+          <w:lang w:val="en-AU" w:eastAsia="zh-CN"/>
+          <w14:ligatures w14:val="none"/>
+        </w:rPr>
+        <w:t xml:space="preserve"> DONE</w:t>
       </w:r>
     </w:p>
     <w:p>
@@ -2106,6 +2139,7 @@
           <w:rFonts w:ascii="Calibri" w:eastAsia="Times New Roman" w:hAnsi="Calibri" w:cs="Calibri"/>
           <w:color w:val="000000"/>
           <w:kern w:val="0"/>
+          <w:highlight w:val="green"/>
           <w:lang w:val="en-AU" w:eastAsia="zh-CN"/>
           <w14:ligatures w14:val="none"/>
         </w:rPr>
@@ -2120,6 +2154,7 @@
           <w:iCs/>
           <w:color w:val="000000"/>
           <w:kern w:val="0"/>
+          <w:highlight w:val="green"/>
           <w:lang w:val="en-AU" w:eastAsia="zh-CN"/>
           <w14:ligatures w14:val="none"/>
         </w:rPr>
@@ -2135,6 +2170,7 @@
           <w:iCs/>
           <w:color w:val="000000"/>
           <w:kern w:val="0"/>
+          <w:highlight w:val="green"/>
           <w:lang w:val="en-AU" w:eastAsia="zh-CN"/>
           <w14:ligatures w14:val="none"/>
         </w:rPr>
@@ -2145,6 +2181,7 @@
           <w:rFonts w:ascii="Calibri" w:eastAsia="Times New Roman" w:hAnsi="Calibri" w:cs="Calibri"/>
           <w:color w:val="000000"/>
           <w:kern w:val="0"/>
+          <w:highlight w:val="green"/>
           <w:lang w:val="en-AU" w:eastAsia="zh-CN"/>
           <w14:ligatures w14:val="none"/>
         </w:rPr>
@@ -2156,6 +2193,7 @@
           <w:rFonts w:ascii="Calibri" w:eastAsia="Times New Roman" w:hAnsi="Calibri" w:cs="Calibri"/>
           <w:color w:val="000000"/>
           <w:kern w:val="0"/>
+          <w:highlight w:val="green"/>
           <w:lang w:val="en-AU" w:eastAsia="zh-CN"/>
           <w14:ligatures w14:val="none"/>
         </w:rPr>
@@ -2167,6 +2205,7 @@
           <w:rFonts w:ascii="Calibri" w:eastAsia="Times New Roman" w:hAnsi="Calibri" w:cs="Calibri"/>
           <w:color w:val="000000"/>
           <w:kern w:val="0"/>
+          <w:highlight w:val="green"/>
           <w:lang w:val="en-AU" w:eastAsia="zh-CN"/>
           <w14:ligatures w14:val="none"/>
         </w:rPr>
@@ -2178,6 +2217,7 @@
           <w:rFonts w:ascii="Calibri" w:eastAsia="Times New Roman" w:hAnsi="Calibri" w:cs="Calibri"/>
           <w:color w:val="000000"/>
           <w:kern w:val="0"/>
+          <w:highlight w:val="green"/>
           <w:lang w:val="en-AU" w:eastAsia="zh-CN"/>
           <w14:ligatures w14:val="none"/>
         </w:rPr>
@@ -2189,6 +2229,7 @@
           <w:rFonts w:ascii="Calibri" w:eastAsia="Times New Roman" w:hAnsi="Calibri" w:cs="Calibri"/>
           <w:color w:val="000000"/>
           <w:kern w:val="0"/>
+          <w:highlight w:val="green"/>
           <w:lang w:val="en-AU" w:eastAsia="zh-CN"/>
           <w14:ligatures w14:val="none"/>
         </w:rPr>
@@ -2200,6 +2241,7 @@
           <w:rFonts w:ascii="Calibri" w:eastAsia="Times New Roman" w:hAnsi="Calibri" w:cs="Calibri"/>
           <w:color w:val="000000"/>
           <w:kern w:val="0"/>
+          <w:highlight w:val="green"/>
           <w:lang w:val="en-AU" w:eastAsia="zh-CN"/>
           <w14:ligatures w14:val="none"/>
         </w:rPr>
@@ -2211,6 +2253,7 @@
           <w:rFonts w:ascii="Calibri" w:eastAsia="Times New Roman" w:hAnsi="Calibri" w:cs="Calibri"/>
           <w:color w:val="000000"/>
           <w:kern w:val="0"/>
+          <w:highlight w:val="green"/>
           <w:lang w:val="en-AU" w:eastAsia="zh-CN"/>
           <w14:ligatures w14:val="none"/>
         </w:rPr>
@@ -2222,6 +2265,7 @@
           <w:rFonts w:ascii="Calibri" w:eastAsia="Times New Roman" w:hAnsi="Calibri" w:cs="Calibri"/>
           <w:color w:val="000000"/>
           <w:kern w:val="0"/>
+          <w:highlight w:val="green"/>
           <w:lang w:val="en-AU" w:eastAsia="zh-CN"/>
           <w14:ligatures w14:val="none"/>
         </w:rPr>
@@ -2233,11 +2277,113 @@
           <w:rFonts w:ascii="Calibri" w:eastAsia="Times New Roman" w:hAnsi="Calibri" w:cs="Calibri"/>
           <w:color w:val="000000"/>
           <w:kern w:val="0"/>
-          <w:lang w:val="en-AU" w:eastAsia="zh-CN"/>
-          <w14:ligatures w14:val="none"/>
-        </w:rPr>
-        <w:t>, the rest of the data can be added after submitting the revised version. NB: upon submitting, I have to declare that all data has been uploaded.</w:t>
-      </w:r>
+          <w:highlight w:val="green"/>
+          <w:lang w:val="en-AU" w:eastAsia="zh-CN"/>
+          <w14:ligatures w14:val="none"/>
+        </w:rPr>
+        <w:t>, the rest of the data can be added after submitting the revised version. NB: upon submitting, I have to declare that all data has been uploaded</w:t>
+      </w:r>
+      <w:r>
+        <w:rPr>
+          <w:rFonts w:ascii="Calibri" w:eastAsia="Times New Roman" w:hAnsi="Calibri" w:cs="Calibri"/>
+          <w:color w:val="000000"/>
+          <w:kern w:val="0"/>
+          <w:highlight w:val="green"/>
+          <w:lang w:val="en-AU" w:eastAsia="zh-CN"/>
+          <w14:ligatures w14:val="none"/>
+        </w:rPr>
+        <w:t xml:space="preserve"> </w:t>
+      </w:r>
+      <w:r>
+        <w:rPr>
+          <w:rFonts w:ascii="Calibri" w:eastAsia="Times New Roman" w:hAnsi="Calibri" w:cs="Calibri"/>
+          <w:color w:val="000000"/>
+          <w:kern w:val="0"/>
+          <w:highlight w:val="green"/>
+          <w:lang w:val="en-AU" w:eastAsia="zh-CN"/>
+          <w14:ligatures w14:val="none"/>
+        </w:rPr>
+        <w:sym w:font="Wingdings" w:char="F0E0"/>
+      </w:r>
+      <w:r>
+        <w:rPr>
+          <w:rFonts w:ascii="Calibri" w:eastAsia="Times New Roman" w:hAnsi="Calibri" w:cs="Calibri"/>
+          <w:color w:val="000000"/>
+          <w:kern w:val="0"/>
+          <w:highlight w:val="green"/>
+          <w:lang w:val="en-AU" w:eastAsia="zh-CN"/>
+          <w14:ligatures w14:val="none"/>
+        </w:rPr>
+        <w:t xml:space="preserve"> DONE</w:t>
+      </w:r>
+    </w:p>
+    <w:p>
+      <w:pPr>
+        <w:numPr>
+          <w:ilvl w:val="0"/>
+          <w:numId w:val="6"/>
+        </w:numPr>
+        <w:spacing w:before="100" w:beforeAutospacing="1" w:after="100" w:afterAutospacing="1"/>
+        <w:rPr>
+          <w:rFonts w:ascii="Calibri" w:eastAsia="Times New Roman" w:hAnsi="Calibri" w:cs="Calibri"/>
+          <w:color w:val="000000"/>
+          <w:kern w:val="0"/>
+          <w:lang w:val="en-AU" w:eastAsia="zh-CN"/>
+          <w14:ligatures w14:val="none"/>
+        </w:rPr>
+      </w:pPr>
+      <w:proofErr w:type="spellStart"/>
+      <w:r>
+        <w:rPr>
+          <w:rFonts w:ascii="Calibri" w:eastAsia="Times New Roman" w:hAnsi="Calibri" w:cs="Calibri"/>
+          <w:b/>
+          <w:bCs/>
+          <w:i/>
+          <w:iCs/>
+          <w:color w:val="000000"/>
+          <w:kern w:val="0"/>
+          <w:lang w:val="en-AU" w:eastAsia="zh-CN"/>
+          <w14:ligatures w14:val="none"/>
+        </w:rPr>
+        <w:t>Zhuzhi</w:t>
+      </w:r>
+      <w:proofErr w:type="spellEnd"/>
+      <w:r>
+        <w:rPr>
+          <w:rFonts w:ascii="Calibri" w:eastAsia="Times New Roman" w:hAnsi="Calibri" w:cs="Calibri"/>
+          <w:b/>
+          <w:bCs/>
+          <w:i/>
+          <w:iCs/>
+          <w:color w:val="000000"/>
+          <w:kern w:val="0"/>
+          <w:lang w:val="en-AU" w:eastAsia="zh-CN"/>
+          <w14:ligatures w14:val="none"/>
+        </w:rPr>
+        <w:t xml:space="preserve">/Maya </w:t>
+      </w:r>
+      <w:r>
+        <w:rPr>
+          <w:rFonts w:ascii="Calibri" w:eastAsia="Times New Roman" w:hAnsi="Calibri" w:cs="Calibri"/>
+          <w:color w:val="000000"/>
+          <w:kern w:val="0"/>
+          <w:lang w:val="en-AU" w:eastAsia="zh-CN"/>
+          <w14:ligatures w14:val="none"/>
+        </w:rPr>
+        <w:sym w:font="Wingdings" w:char="F0E0"/>
+      </w:r>
+      <w:r>
+        <w:rPr>
+          <w:rFonts w:ascii="Calibri" w:eastAsia="Times New Roman" w:hAnsi="Calibri" w:cs="Calibri"/>
+          <w:color w:val="000000"/>
+          <w:kern w:val="0"/>
+          <w:lang w:val="en-AU" w:eastAsia="zh-CN"/>
+          <w14:ligatures w14:val="none"/>
+        </w:rPr>
+        <w:t xml:space="preserve"> submit all raw data</w:t>
+      </w:r>
+      <w:bookmarkStart w:id="0" w:name="_GoBack"/>
+      <w:bookmarkEnd w:id="0"/>
     </w:p>
     <w:p>
       <w:pPr>

</xml_diff>